<commit_message>
Quick Update 2026-05-13 11:38
</commit_message>
<xml_diff>
--- a/data/jobs/00378_f5e1448c/generated/cover.docx
+++ b/data/jobs/00378_f5e1448c/generated/cover.docx
@@ -32,7 +32,7 @@
           <w:rFonts w:ascii="Arial" w:hAnsi="Arial"/>
           <w:sz w:val="22"/>
         </w:rPr>
-        <w:t>May 12, 2026</w:t>
+        <w:t>May 13, 2026</w:t>
         <w:br/>
         <w:br/>
       </w:r>
@@ -52,7 +52,7 @@
           <w:rFonts w:ascii="Arial" w:hAnsi="Arial"/>
           <w:sz w:val="22"/>
         </w:rPr>
-        <w:t>I am interested in the Observability Platform Engineer role in the Dallas-Fort Worth Metroplex. The position aligns strongly with my background in APM, telemetry analysis, performance engineering, production reliability, dashboards, alerting, Python automation, and large-scale monitoring environments.</w:t>
+        <w:t>I am interested in the Observability Platform Engineer opportunity supporting NorthMark Compute Cloud / NM2.com. The role aligns with my background in enterprise observability, telemetry analysis, APM platforms, dashboards, alerting, production troubleshooting, Python automation, cloud-first data workflows, and reliability engineering.</w:t>
       </w:r>
     </w:p>
     <w:p>
@@ -79,7 +79,7 @@
           <w:rFonts w:ascii="Arial" w:hAnsi="Arial"/>
           <w:sz w:val="22"/>
         </w:rPr>
-        <w:t>I want to be direct about fit: my strongest observability background is enterprise APM, telemetry analytics, performance engineering, dashboarding, scripting, and production troubleshooting. Prometheus, Grafana, OpenTelemetry, Kubernetes, GPU-cluster observability, and IaC/deployment automation are adjacent or learning areas rather than deep production ownership. Where I would bring immediate value is telemetry interpretation, APM operations, reliability troubleshooting, Python automation, alert/dashboard quality, and clear collaboration with infrastructure and engineering teams.</w:t>
+        <w:t>For this NM2 platform context, I would position my deepest production strength as enterprise APM, telemetry analysis, dashboards, alerting, RCA, performance engineering, and Python/shell automation. OpenTelemetry, Grafana, Prometheus, Terraform/IaC, Kubernetes-aware environments, and GPU/HPC workload monitoring are important cloud-native platform areas I am actively ramping into, but I would not overstate them as long-term production ownership. Where I would bring immediate value is telemetry interpretation, platform reliability thinking, automation, troubleshooting, and clear communication with infrastructure and engineering teams.</w:t>
       </w:r>
     </w:p>
     <w:p>
@@ -88,7 +88,7 @@
           <w:rFonts w:ascii="Arial" w:hAnsi="Arial"/>
           <w:sz w:val="22"/>
         </w:rPr>
-        <w:t>I would welcome the opportunity to discuss how my observability, APM, telemetry, Python, performance engineering, and production reliability background can support this platform engineering team.</w:t>
+        <w:t>I would welcome the opportunity to discuss how my observability, APM, telemetry, Python automation, performance engineering, and production reliability background can support NM2's cloud-first PaaS observability needs.</w:t>
       </w:r>
     </w:p>
     <w:p>

</xml_diff>